<commit_message>
Populate performance reports from live IO data and add report history list.
Wire all template placeholders from valuations, trades, and fund records instead of N/A defaults, patch the Word template, and expose GET /investment-ops/reports for paginated run history.

Co-authored-by: Cursor <cursoragent@cursor.com>
</commit_message>
<xml_diff>
--- a/storage/report-templates/investment-ops/performance-report.docx
+++ b/storage/report-templates/investment-ops/performance-report.docx
@@ -1771,7 +1771,7 @@
                 <w:color w:val="111827"/>
                 <w:sz w:val="15"/>
               </w:rPr>
-              <w:t>N/A</w:t>
+              <w:t>{dashboard_opening_benchmark}</w:t>
             </w:r>
           </w:p>
         </w:tc>
@@ -1799,7 +1799,7 @@
                 <w:color w:val="111827"/>
                 <w:sz w:val="15"/>
               </w:rPr>
-              <w:t>N/A</w:t>
+              <w:t>{dashboard_opening_excess}</w:t>
             </w:r>
           </w:p>
         </w:tc>
@@ -1937,7 +1937,7 @@
                 <w:color w:val="111827"/>
                 <w:sz w:val="15"/>
               </w:rPr>
-              <w:t>N/A</w:t>
+              <w:t>{dashboard_closing_benchmark}</w:t>
             </w:r>
           </w:p>
         </w:tc>
@@ -1965,7 +1965,7 @@
                 <w:color w:val="111827"/>
                 <w:sz w:val="15"/>
               </w:rPr>
-              <w:t>N/A</w:t>
+              <w:t>{dashboard_closing_excess}</w:t>
             </w:r>
           </w:p>
         </w:tc>
@@ -2103,7 +2103,7 @@
                 <w:color w:val="111827"/>
                 <w:sz w:val="15"/>
               </w:rPr>
-              <w:t>N/A</w:t>
+              <w:t>{dashboard_cashflows_benchmark}</w:t>
             </w:r>
           </w:p>
         </w:tc>
@@ -2131,7 +2131,7 @@
                 <w:color w:val="111827"/>
                 <w:sz w:val="15"/>
               </w:rPr>
-              <w:t>N/A</w:t>
+              <w:t>{dashboard_cashflows_excess}</w:t>
             </w:r>
           </w:p>
         </w:tc>
@@ -2269,7 +2269,7 @@
                 <w:color w:val="111827"/>
                 <w:sz w:val="15"/>
               </w:rPr>
-              <w:t>N/A</w:t>
+              <w:t>{dashboard_realised_benchmark}</w:t>
             </w:r>
           </w:p>
         </w:tc>
@@ -2297,7 +2297,7 @@
                 <w:color w:val="111827"/>
                 <w:sz w:val="15"/>
               </w:rPr>
-              <w:t>N/A</w:t>
+              <w:t>{dashboard_realised_excess}</w:t>
             </w:r>
           </w:p>
         </w:tc>
@@ -2435,7 +2435,7 @@
                 <w:color w:val="111827"/>
                 <w:sz w:val="15"/>
               </w:rPr>
-              <w:t>N/A</w:t>
+              <w:t>{dashboard_unrealised_benchmark}</w:t>
             </w:r>
           </w:p>
         </w:tc>
@@ -2463,7 +2463,7 @@
                 <w:color w:val="111827"/>
                 <w:sz w:val="15"/>
               </w:rPr>
-              <w:t>N/A</w:t>
+              <w:t>{dashboard_unrealised_excess}</w:t>
             </w:r>
           </w:p>
         </w:tc>
@@ -8634,7 +8634,7 @@
                 <w:color w:val="111827"/>
                 <w:sz w:val="14"/>
               </w:rPr>
-              <w:t>N/A</w:t>
+              <w:t>{client_contributions_ytd}</w:t>
             </w:r>
           </w:p>
         </w:tc>
@@ -8773,7 +8773,7 @@
                 <w:color w:val="111827"/>
                 <w:sz w:val="14"/>
               </w:rPr>
-              <w:t>N/A</w:t>
+              <w:t>{client_withdrawals_ytd}</w:t>
             </w:r>
           </w:p>
         </w:tc>
@@ -9991,7 +9991,7 @@
                 <w:color w:val="111827"/>
                 <w:sz w:val="14"/>
               </w:rPr>
-              <w:t>N/A</w:t>
+              <w:t>{liquidity_treatment}</w:t>
             </w:r>
           </w:p>
         </w:tc>

</xml_diff>

<commit_message>
Add all 16 Investment Operations DOCX report templates with scope engine.
Register Arcus Word templates, flexible FIRM/FUND/CLIENT scope on report runs, shared placeholder fill engine from live IO data, and all-reports VPS UAT.

Co-authored-by: Cursor <cursoragent@cursor.com>
</commit_message>
<xml_diff>
--- a/storage/report-templates/investment-ops/performance-report.docx
+++ b/storage/report-templates/investment-ops/performance-report.docx
@@ -1771,7 +1771,7 @@
                 <w:color w:val="111827"/>
                 <w:sz w:val="15"/>
               </w:rPr>
-              <w:t>{dashboard_opening_benchmark}</w:t>
+              <w:t>{auto_na_field_1}</w:t>
             </w:r>
           </w:p>
         </w:tc>
@@ -1799,7 +1799,7 @@
                 <w:color w:val="111827"/>
                 <w:sz w:val="15"/>
               </w:rPr>
-              <w:t>{dashboard_opening_excess}</w:t>
+              <w:t>{auto_na_field_2}</w:t>
             </w:r>
           </w:p>
         </w:tc>
@@ -1937,7 +1937,7 @@
                 <w:color w:val="111827"/>
                 <w:sz w:val="15"/>
               </w:rPr>
-              <w:t>{dashboard_closing_benchmark}</w:t>
+              <w:t>{auto_na_field_3}</w:t>
             </w:r>
           </w:p>
         </w:tc>
@@ -1965,7 +1965,7 @@
                 <w:color w:val="111827"/>
                 <w:sz w:val="15"/>
               </w:rPr>
-              <w:t>{dashboard_closing_excess}</w:t>
+              <w:t>{auto_na_field_4}</w:t>
             </w:r>
           </w:p>
         </w:tc>
@@ -2103,7 +2103,7 @@
                 <w:color w:val="111827"/>
                 <w:sz w:val="15"/>
               </w:rPr>
-              <w:t>{dashboard_cashflows_benchmark}</w:t>
+              <w:t>{auto_na_field_5}</w:t>
             </w:r>
           </w:p>
         </w:tc>
@@ -2131,7 +2131,7 @@
                 <w:color w:val="111827"/>
                 <w:sz w:val="15"/>
               </w:rPr>
-              <w:t>{dashboard_cashflows_excess}</w:t>
+              <w:t>{auto_na_field_6}</w:t>
             </w:r>
           </w:p>
         </w:tc>
@@ -2269,7 +2269,7 @@
                 <w:color w:val="111827"/>
                 <w:sz w:val="15"/>
               </w:rPr>
-              <w:t>{dashboard_realised_benchmark}</w:t>
+              <w:t>{auto_na_field_7}</w:t>
             </w:r>
           </w:p>
         </w:tc>
@@ -2297,7 +2297,7 @@
                 <w:color w:val="111827"/>
                 <w:sz w:val="15"/>
               </w:rPr>
-              <w:t>{dashboard_realised_excess}</w:t>
+              <w:t>{auto_na_field_8}</w:t>
             </w:r>
           </w:p>
         </w:tc>
@@ -2435,7 +2435,7 @@
                 <w:color w:val="111827"/>
                 <w:sz w:val="15"/>
               </w:rPr>
-              <w:t>{dashboard_unrealised_benchmark}</w:t>
+              <w:t>{auto_na_field_9}</w:t>
             </w:r>
           </w:p>
         </w:tc>
@@ -2463,7 +2463,7 @@
                 <w:color w:val="111827"/>
                 <w:sz w:val="15"/>
               </w:rPr>
-              <w:t>{dashboard_unrealised_excess}</w:t>
+              <w:t>{auto_na_field_10}</w:t>
             </w:r>
           </w:p>
         </w:tc>
@@ -8634,7 +8634,7 @@
                 <w:color w:val="111827"/>
                 <w:sz w:val="14"/>
               </w:rPr>
-              <w:t>{client_contributions_ytd}</w:t>
+              <w:t>{auto_na_field_11}</w:t>
             </w:r>
           </w:p>
         </w:tc>
@@ -8773,7 +8773,7 @@
                 <w:color w:val="111827"/>
                 <w:sz w:val="14"/>
               </w:rPr>
-              <w:t>{client_withdrawals_ytd}</w:t>
+              <w:t>{auto_na_field_12}</w:t>
             </w:r>
           </w:p>
         </w:tc>
@@ -9991,7 +9991,7 @@
                 <w:color w:val="111827"/>
                 <w:sz w:val="14"/>
               </w:rPr>
-              <w:t>{liquidity_treatment}</w:t>
+              <w:t>{auto_na_field_13}</w:t>
             </w:r>
           </w:p>
         </w:tc>

</xml_diff>